<commit_message>
Add security audit, roadmap, and updated DZ-9 submission docs.
Co-authored-by: Cursor <cursoragent@cursor.com>
</commit_message>
<xml_diff>
--- a/DZ-9_РУКОВОДСТВО_И_ПЗ.docx
+++ b/DZ-9_РУКОВОДСТВО_И_ПЗ.docx
@@ -49,6 +49,17 @@
         <w:rPr>
           <w:b/>
         </w:rPr>
+        <w:t xml:space="preserve">GitHub: </w:t>
+      </w:r>
+      <w:r>
+        <w:t>https://github.com/treshkash323-alt/designstudio-crm</w:t>
+      </w:r>
+    </w:p>
+    <w:p>
+      <w:r>
+        <w:rPr>
+          <w:b/>
+        </w:rPr>
         <w:t xml:space="preserve">Папка: </w:t>
       </w:r>
       <w:r>
@@ -63,7 +74,7 @@
         <w:t xml:space="preserve">Дата: </w:t>
       </w:r>
       <w:r>
-        <w:t>июнь 2026</w:t>
+        <w:t>08.06.2026</w:t>
       </w:r>
     </w:p>
     <w:p>
@@ -88,7 +99,7 @@
     </w:p>
     <w:p>
       <w:r>
-        <w:t>Документ объединяет пояснительную записку к ДЗ-9 и руководство по эксплуатации. Цель — чтобы вы могли самостоятельно запускать проект, понимать RLS и роли, работать со Studio и сдавать домашку со скринами.</w:t>
+        <w:t>Пояснительная записка и руководство по локальной CRM: Docker, Supabase, RLS, роли manager/admin, безопасность и чеклист сдачи. Код на GitHub без секретов.</w:t>
       </w:r>
     </w:p>
     <w:p>
@@ -101,7 +112,7 @@
     </w:p>
     <w:p>
       <w:r>
-        <w:t>Локальная CRM для отдела продаж DesignStudio: менеджер видит только своих лидов, админ — всех. Стек: Docker + Supabase CLI + Next.js 14 + PostgreSQL RLS.</w:t>
+        <w:t>Локальная CRM DesignStudio: менеджер видит только своих лидов, админ — всех. Стек: Docker + Supabase CLI + Next.js 14 + PostgreSQL RLS.</w:t>
       </w:r>
     </w:p>
     <w:p>
@@ -167,7 +178,7 @@
           </w:tcPr>
           <w:p>
             <w:r>
-              <w:t>Запускает контейнеры — «коробки» с Supabase на вашем ПК</w:t>
+              <w:t>Контейнеры Supabase на вашем ПК</w:t>
             </w:r>
           </w:p>
         </w:tc>
@@ -189,7 +200,7 @@
           </w:tcPr>
           <w:p>
             <w:r>
-              <w:t>Команда npx supabase start — поднимает БД и Auth локально</w:t>
+              <w:t>npx supabase start — БД и Auth локально</w:t>
             </w:r>
           </w:p>
         </w:tc>
@@ -211,7 +222,7 @@
           </w:tcPr>
           <w:p>
             <w:r>
-              <w:t>Веб-панель http://localhost:54323 — таблицы, SQL, пользователи</w:t>
+              <w:t>http://localhost:54323 — таблицы, SQL, пользователи</w:t>
             </w:r>
           </w:p>
         </w:tc>
@@ -233,7 +244,7 @@
           </w:tcPr>
           <w:p>
             <w:r>
-              <w:t>Правила в PostgreSQL: кто какие строки таблицы видит</w:t>
+              <w:t>Правила PostgreSQL: кто какие строки видит</w:t>
             </w:r>
           </w:p>
         </w:tc>
@@ -255,7 +266,7 @@
           </w:tcPr>
           <w:p>
             <w:r>
-              <w:t>Токен после входа; внутри role для admin</w:t>
+              <w:t>Токен после входа; role admin в app_metadata</w:t>
             </w:r>
           </w:p>
         </w:tc>
@@ -277,7 +288,7 @@
           </w:tcPr>
           <w:p>
             <w:r>
-              <w:t>Публичный ключ приложения (в .env.local)</w:t>
+              <w:t>Публичный ключ в .env.local (с RLS)</w:t>
             </w:r>
           </w:p>
         </w:tc>
@@ -299,7 +310,7 @@
           </w:tcPr>
           <w:p>
             <w:r>
-              <w:t>Секретный ключ только на сервере, обходит RLS</w:t>
+              <w:t>Секретный ключ только на сервере</w:t>
             </w:r>
           </w:p>
         </w:tc>
@@ -500,12 +511,184 @@
         <w:pStyle w:val="Heading1"/>
       </w:pPr>
       <w:r>
-        <w:t>6. Security Advisor (2 warning)</w:t>
+        <w:t>6. Безопасность (кратко)</w:t>
       </w:r>
     </w:p>
+    <w:tbl>
+      <w:tblPr>
+        <w:tblStyle w:val="TableGrid"/>
+        <w:tblW w:type="auto" w:w="0"/>
+        <w:tblLook w:firstColumn="1" w:firstRow="1" w:lastColumn="0" w:lastRow="0" w:noHBand="0" w:noVBand="1" w:val="04A0"/>
+      </w:tblPr>
+      <w:tblGrid>
+        <w:gridCol w:w="4844"/>
+        <w:gridCol w:w="4844"/>
+      </w:tblGrid>
+      <w:tr>
+        <w:tc>
+          <w:tcPr>
+            <w:tcW w:type="dxa" w:w="4844"/>
+          </w:tcPr>
+          <w:p>
+            <w:r>
+              <w:rPr>
+                <w:b/>
+              </w:rPr>
+              <w:t>Проверка</w:t>
+            </w:r>
+          </w:p>
+        </w:tc>
+        <w:tc>
+          <w:tcPr>
+            <w:tcW w:type="dxa" w:w="4844"/>
+          </w:tcPr>
+          <w:p>
+            <w:r>
+              <w:rPr>
+                <w:b/>
+              </w:rPr>
+              <w:t>Результат</w:t>
+            </w:r>
+          </w:p>
+        </w:tc>
+      </w:tr>
+      <w:tr>
+        <w:tc>
+          <w:tcPr>
+            <w:tcW w:type="dxa" w:w="4844"/>
+          </w:tcPr>
+          <w:p>
+            <w:r>
+              <w:t>.env.local в git</w:t>
+            </w:r>
+          </w:p>
+        </w:tc>
+        <w:tc>
+          <w:tcPr>
+            <w:tcW w:type="dxa" w:w="4844"/>
+          </w:tcPr>
+          <w:p>
+            <w:r>
+              <w:t>Нет — только .env.local.example</w:t>
+            </w:r>
+          </w:p>
+        </w:tc>
+      </w:tr>
+      <w:tr>
+        <w:tc>
+          <w:tcPr>
+            <w:tcW w:type="dxa" w:w="4844"/>
+          </w:tcPr>
+          <w:p>
+            <w:r>
+              <w:t>RLS leads/profiles</w:t>
+            </w:r>
+          </w:p>
+        </w:tc>
+        <w:tc>
+          <w:tcPr>
+            <w:tcW w:type="dxa" w:w="4844"/>
+          </w:tcPr>
+          <w:p>
+            <w:r>
+              <w:t>Да — manager 2 / admin 5</w:t>
+            </w:r>
+          </w:p>
+        </w:tc>
+      </w:tr>
+      <w:tr>
+        <w:tc>
+          <w:tcPr>
+            <w:tcW w:type="dxa" w:w="4844"/>
+          </w:tcPr>
+          <w:p>
+            <w:r>
+              <w:t>Middleware /admin</w:t>
+            </w:r>
+          </w:p>
+        </w:tc>
+        <w:tc>
+          <w:tcPr>
+            <w:tcW w:type="dxa" w:w="4844"/>
+          </w:tcPr>
+          <w:p>
+            <w:r>
+              <w:t>Да — manager редирект</w:t>
+            </w:r>
+          </w:p>
+        </w:tc>
+      </w:tr>
+      <w:tr>
+        <w:tc>
+          <w:tcPr>
+            <w:tcW w:type="dxa" w:w="4844"/>
+          </w:tcPr>
+          <w:p>
+            <w:r>
+              <w:t>service_role в браузере</w:t>
+            </w:r>
+          </w:p>
+        </w:tc>
+        <w:tc>
+          <w:tcPr>
+            <w:tcW w:type="dxa" w:w="4844"/>
+          </w:tcPr>
+          <w:p>
+            <w:r>
+              <w:t>Нет — admin.ts не в UI</w:t>
+            </w:r>
+          </w:p>
+        </w:tc>
+      </w:tr>
+      <w:tr>
+        <w:tc>
+          <w:tcPr>
+            <w:tcW w:type="dxa" w:w="4844"/>
+          </w:tcPr>
+          <w:p>
+            <w:r>
+              <w:t>Security Advisor</w:t>
+            </w:r>
+          </w:p>
+        </w:tc>
+        <w:tc>
+          <w:tcPr>
+            <w:tcW w:type="dxa" w:w="4844"/>
+          </w:tcPr>
+          <w:p>
+            <w:r>
+              <w:t>0 errors, 2 warnings (handle_new_user)</w:t>
+            </w:r>
+          </w:p>
+        </w:tc>
+      </w:tr>
+      <w:tr>
+        <w:tc>
+          <w:tcPr>
+            <w:tcW w:type="dxa" w:w="4844"/>
+          </w:tcPr>
+          <w:p>
+            <w:r>
+              <w:t>Доступ из интернета</w:t>
+            </w:r>
+          </w:p>
+        </w:tc>
+        <w:tc>
+          <w:tcPr>
+            <w:tcW w:type="dxa" w:w="4844"/>
+          </w:tcPr>
+          <w:p>
+            <w:r>
+              <w:t>Нет — localhost</w:t>
+            </w:r>
+          </w:p>
+        </w:tc>
+      </w:tr>
+    </w:tbl>
+    <w:p/>
     <w:p>
       <w:r>
-        <w:t>Предупреждения про handle_new_user() — типичны для триггера регистрации SECURITY DEFINER. Для учебного локального проекта допустимо. В проде настраивают REVOKE EXECUTE.</w:t>
+        <w:t>Подробно: SECURITY.md в репозитории.</w:t>
       </w:r>
     </w:p>
     <w:p>
@@ -513,7 +696,7 @@
         <w:pStyle w:val="Heading1"/>
       </w:pPr>
       <w:r>
-        <w:t>7. Сдача ДЗ</w:t>
+        <w:t>7. Сдача ДЗ — чеклист</w:t>
       </w:r>
     </w:p>
     <w:p>
@@ -521,7 +704,7 @@
         <w:pStyle w:val="ListBullet"/>
       </w:pPr>
       <w:r>
-        <w:t>Скрин менеджера: dashboard, 2 клиента</w:t>
+        <w:t>Обязательные скрины:</w:t>
       </w:r>
     </w:p>
     <w:p>
@@ -529,7 +712,7 @@
         <w:pStyle w:val="ListBullet"/>
       </w:pPr>
       <w:r>
-        <w:t>Скрин админа: /admin/clients, 5 клиентов</w:t>
+        <w:t>Менеджер: /dashboard, 2 клиента, RLS «(2)»</w:t>
       </w:r>
     </w:p>
     <w:p>
@@ -537,7 +720,28 @@
         <w:pStyle w:val="ListBullet"/>
       </w:pPr>
       <w:r>
-        <w:t>Опционально: Docker Containers или Studio → leads</w:t>
+        <w:t>Админ: /admin/clients, 5 строк, бейдж АДМИН</w:t>
+      </w:r>
+    </w:p>
+    <w:p>
+      <w:pPr>
+        <w:pStyle w:val="ListBullet"/>
+      </w:pPr>
+      <w:r>
+        <w:t>Желательно: Docker, Studio → leads, Advisor 0 errors</w:t>
+      </w:r>
+    </w:p>
+    <w:p>
+      <w:pPr>
+        <w:pStyle w:val="ListBullet"/>
+      </w:pPr>
+      <w:r>
+        <w:t>На скринах замазать anon/service keys при необходимости</w:t>
+      </w:r>
+    </w:p>
+    <w:p>
+      <w:r>
+        <w:t>Документы: DZ-9_отчёт_для_сдачи.docx, SECURITY.md, TODO_ROADMAP.md</w:t>
       </w:r>
     </w:p>
     <w:p>
@@ -545,12 +749,44 @@
         <w:pStyle w:val="Heading1"/>
       </w:pPr>
       <w:r>
-        <w:t>8. Заключение</w:t>
+        <w:t>8. Развитие после ДЗ (TODO)</w:t>
+      </w:r>
+    </w:p>
+    <w:p>
+      <w:pPr>
+        <w:pStyle w:val="ListBullet"/>
+      </w:pPr>
+      <w:r>
+        <w:t>EDU (AIKIVAVIORA): student / teacher / admin, курсы, RLS — см. TODO_ROADMAP.md</w:t>
+      </w:r>
+    </w:p>
+    <w:p>
+      <w:pPr>
+        <w:pStyle w:val="ListBullet"/>
+      </w:pPr>
+      <w:r>
+        <w:t>Tilda: лендинг и интеграция — отдельное обсуждение, не блокирует ДЗ-9</w:t>
+      </w:r>
+    </w:p>
+    <w:p>
+      <w:pPr>
+        <w:pStyle w:val="ListBullet"/>
+      </w:pPr>
+      <w:r>
+        <w:t>Prod: invite-only, уникальные ключи, CI — см. SECURITY.md §4</w:t>
+      </w:r>
+    </w:p>
+    <w:p>
+      <w:pPr>
+        <w:pStyle w:val="Heading1"/>
+      </w:pPr>
+      <w:r>
+        <w:t>9. Заключение</w:t>
       </w:r>
     </w:p>
     <w:p>
       <w:r>
-        <w:t>ДЗ выполнено: локальный Supabase, RLS, два пользователя, разграничение доступа. Подробные пояснения, примеры SQL и troubleshooting — в DZ-9_РУКОВОДСТВО_И_ПЗ.md.</w:t>
+        <w:t>ДЗ выполнено: локальный Supabase, RLS, два пользователя, разграничение 2 vs 5 лидов. Код на GitHub без секретов. Подробности — в DZ-9_РУКОВОДСТВО_И_ПЗ.md.</w:t>
       </w:r>
     </w:p>
     <w:sectPr>

</xml_diff>